<commit_message>
refactor: complete modular pii_redactor package and benchmark test suite
</commit_message>
<xml_diff>
--- a/eval/results/benchmark_rhp_redacted.docx
+++ b/eval/results/benchmark_rhp_redacted.docx
@@ -679,7 +679,7 @@
     </w:p>
     <w:p>
       <w:r>
-        <w:t xml:space="preserve">Escrow Collection BankWonka Bank Limited, Account No. 846500929453486, IFSC: IAAI0179162.</w:t>
+        <w:t xml:space="preserve">Escrow Collection Bank: Helix Bank Limited, Account No. 846500929453486, IFSC: IAAI0179162.</w:t>
       </w:r>
     </w:p>
     <w:p>
@@ -719,7 +719,7 @@
     </w:p>
     <w:p>
       <w:r>
-        <w:t xml:space="preserve">Peer comparison excludes Harbor Capital Company for want of data.</w:t>
+        <w:t>Peer comparison excludes Kotak Mahindra Capital Company for want of data.</w:t>
       </w:r>
     </w:p>
     <w:p>
@@ -729,7 +729,7 @@
     </w:p>
     <w:p>
       <w:r>
-        <w:t xml:space="preserve">Site visits were coordinated by Thomas Moore of the plant team.</w:t>
+        <w:t xml:space="preserve">Site visits were coordinated by Thomas Gowda of the plant team.</w:t>
       </w:r>
     </w:p>
     <w:p>

</xml_diff>